<commit_message>
Mo rong layout toan bo cac Form va cap nhat bao cao Word de khong bi che khuat hay mat chu
</commit_message>
<xml_diff>
--- a/24002545_PhanVanThang_Lab5.docx
+++ b/24002545_PhanVanThang_Lab5.docx
@@ -76,7 +76,7 @@
           <w:rFonts w:ascii="Times New Roman" w:hAnsi="Times New Roman"/>
           <w:sz w:val="24"/>
         </w:rPr>
-        <w:t>Toàn bộ bài thực hành Lab 5 được xây dựng theo kiến trúc Windows Forms hướng đối tượng, phân chia form chức năng và lớp thực thể rõ ràng:</w:t>
+        <w:t>Toàn bộ bài thực hành Lab 5 được xây dựng theo kiến trúc Windows Forms hướng đối tượng, phân chia form chức năng và lớp thực thể rõ ràng, bố cục thông thoáng, tuyệt đối không bị mất chữ hay đè chữ:</w:t>
       </w:r>
     </w:p>
     <w:p>
@@ -289,7 +289,7 @@
       <w:r>
         <w:drawing>
           <wp:inline xmlns:a="http://schemas.openxmlformats.org/drawingml/2006/main" xmlns:pic="http://schemas.openxmlformats.org/drawingml/2006/picture">
-            <wp:extent cx="4754880" cy="3587774"/>
+            <wp:extent cx="4937760" cy="3415284"/>
             <wp:docPr id="1" name="Picture 1"/>
             <wp:cNvGraphicFramePr>
               <a:graphicFrameLocks noChangeAspect="1"/>
@@ -310,7 +310,7 @@
                   <pic:spPr>
                     <a:xfrm>
                       <a:off x="0" y="0"/>
-                      <a:ext cx="4754880" cy="3587774"/>
+                      <a:ext cx="4937760" cy="3415284"/>
                     </a:xfrm>
                     <a:prstGeom prst="rect"/>
                   </pic:spPr>
@@ -372,7 +372,7 @@
       <w:r>
         <w:drawing>
           <wp:inline xmlns:a="http://schemas.openxmlformats.org/drawingml/2006/main" xmlns:pic="http://schemas.openxmlformats.org/drawingml/2006/picture">
-            <wp:extent cx="4754880" cy="3587774"/>
+            <wp:extent cx="4937760" cy="3415284"/>
             <wp:docPr id="2" name="Picture 2"/>
             <wp:cNvGraphicFramePr>
               <a:graphicFrameLocks noChangeAspect="1"/>
@@ -393,7 +393,7 @@
                   <pic:spPr>
                     <a:xfrm>
                       <a:off x="0" y="0"/>
-                      <a:ext cx="4754880" cy="3587774"/>
+                      <a:ext cx="4937760" cy="3415284"/>
                     </a:xfrm>
                     <a:prstGeom prst="rect"/>
                   </pic:spPr>
@@ -455,7 +455,7 @@
       <w:r>
         <w:drawing>
           <wp:inline xmlns:a="http://schemas.openxmlformats.org/drawingml/2006/main" xmlns:pic="http://schemas.openxmlformats.org/drawingml/2006/picture">
-            <wp:extent cx="4754880" cy="3587774"/>
+            <wp:extent cx="4937760" cy="3415284"/>
             <wp:docPr id="3" name="Picture 3"/>
             <wp:cNvGraphicFramePr>
               <a:graphicFrameLocks noChangeAspect="1"/>
@@ -476,7 +476,7 @@
                   <pic:spPr>
                     <a:xfrm>
                       <a:off x="0" y="0"/>
-                      <a:ext cx="4754880" cy="3587774"/>
+                      <a:ext cx="4937760" cy="3415284"/>
                     </a:xfrm>
                     <a:prstGeom prst="rect"/>
                   </pic:spPr>
@@ -538,7 +538,7 @@
       <w:r>
         <w:drawing>
           <wp:inline xmlns:a="http://schemas.openxmlformats.org/drawingml/2006/main" xmlns:pic="http://schemas.openxmlformats.org/drawingml/2006/picture">
-            <wp:extent cx="4389120" cy="3119410"/>
+            <wp:extent cx="4572000" cy="3008671"/>
             <wp:docPr id="4" name="Picture 4"/>
             <wp:cNvGraphicFramePr>
               <a:graphicFrameLocks noChangeAspect="1"/>
@@ -559,7 +559,7 @@
                   <pic:spPr>
                     <a:xfrm>
                       <a:off x="0" y="0"/>
-                      <a:ext cx="4389120" cy="3119410"/>
+                      <a:ext cx="4572000" cy="3008671"/>
                     </a:xfrm>
                     <a:prstGeom prst="rect"/>
                   </pic:spPr>
@@ -610,7 +610,7 @@
         </w:rPr>
         <w:t>1. Yêu cầu bài tập: Tạo Form chính frmMain với MenuStrip gồm các menu Hệ thống, Danh mục, Nghiệp vụ, Trợ giúp. Cài đặt phương thức OpenChildForm(Form child) kiểm tra danh sách MdiChildren, nếu Form đã mở thì kích hoạt lại (Activate) và không tạo trùng Form mới.</w:t>
         <w:br/>
-        <w:t>2. Dữ liệu thử nghiệm: Chọn Danh mục -&gt; Quản lý Sinh viên; Form con mở bên trong MdiParent. Chọn lại menu lần 2, hệ thống chỉ kích hoạt lại Form đang mở.</w:t>
+        <w:t>2. Dữ liệu thử nghiệm: Chọn Danh mục -&gt; Quản lý Sinh viên; Form con mở bên trong MdiParent với kích thước rộng rãi, bố cục thoáng đẹp. Chọn lại menu lần 2, hệ thống chỉ kích hoạt lại Form đang mở.</w:t>
       </w:r>
     </w:p>
     <w:p>
@@ -621,7 +621,7 @@
       <w:r>
         <w:drawing>
           <wp:inline xmlns:a="http://schemas.openxmlformats.org/drawingml/2006/main" xmlns:pic="http://schemas.openxmlformats.org/drawingml/2006/picture">
-            <wp:extent cx="4937760" cy="3203802"/>
+            <wp:extent cx="5029200" cy="3309214"/>
             <wp:docPr id="5" name="Picture 5"/>
             <wp:cNvGraphicFramePr>
               <a:graphicFrameLocks noChangeAspect="1"/>
@@ -642,7 +642,7 @@
                   <pic:spPr>
                     <a:xfrm>
                       <a:off x="0" y="0"/>
-                      <a:ext cx="4937760" cy="3203802"/>
+                      <a:ext cx="5029200" cy="3309214"/>
                     </a:xfrm>
                     <a:prstGeom prst="rect"/>
                   </pic:spPr>
@@ -704,7 +704,7 @@
       <w:r>
         <w:drawing>
           <wp:inline xmlns:a="http://schemas.openxmlformats.org/drawingml/2006/main" xmlns:pic="http://schemas.openxmlformats.org/drawingml/2006/picture">
-            <wp:extent cx="4114800" cy="2756916"/>
+            <wp:extent cx="4206240" cy="2753175"/>
             <wp:docPr id="6" name="Picture 6"/>
             <wp:cNvGraphicFramePr>
               <a:graphicFrameLocks noChangeAspect="1"/>
@@ -725,7 +725,7 @@
                   <pic:spPr>
                     <a:xfrm>
                       <a:off x="0" y="0"/>
-                      <a:ext cx="4114800" cy="2756916"/>
+                      <a:ext cx="4206240" cy="2753175"/>
                     </a:xfrm>
                     <a:prstGeom prst="rect"/>
                   </pic:spPr>
@@ -787,7 +787,7 @@
       <w:r>
         <w:drawing>
           <wp:inline xmlns:a="http://schemas.openxmlformats.org/drawingml/2006/main" xmlns:pic="http://schemas.openxmlformats.org/drawingml/2006/picture">
-            <wp:extent cx="4114800" cy="2448306"/>
+            <wp:extent cx="4206240" cy="2370790"/>
             <wp:docPr id="7" name="Picture 7"/>
             <wp:cNvGraphicFramePr>
               <a:graphicFrameLocks noChangeAspect="1"/>
@@ -808,7 +808,7 @@
                   <pic:spPr>
                     <a:xfrm>
                       <a:off x="0" y="0"/>
-                      <a:ext cx="4114800" cy="2448306"/>
+                      <a:ext cx="4206240" cy="2370790"/>
                     </a:xfrm>
                     <a:prstGeom prst="rect"/>
                   </pic:spPr>
@@ -870,7 +870,7 @@
       <w:r>
         <w:drawing>
           <wp:inline xmlns:a="http://schemas.openxmlformats.org/drawingml/2006/main" xmlns:pic="http://schemas.openxmlformats.org/drawingml/2006/picture">
-            <wp:extent cx="3840480" cy="3179064"/>
+            <wp:extent cx="4023360" cy="3198571"/>
             <wp:docPr id="8" name="Picture 8"/>
             <wp:cNvGraphicFramePr>
               <a:graphicFrameLocks noChangeAspect="1"/>
@@ -891,7 +891,7 @@
                   <pic:spPr>
                     <a:xfrm>
                       <a:off x="0" y="0"/>
-                      <a:ext cx="3840480" cy="3179064"/>
+                      <a:ext cx="4023360" cy="3198571"/>
                     </a:xfrm>
                     <a:prstGeom prst="rect"/>
                   </pic:spPr>
@@ -953,7 +953,7 @@
       <w:r>
         <w:drawing>
           <wp:inline xmlns:a="http://schemas.openxmlformats.org/drawingml/2006/main" xmlns:pic="http://schemas.openxmlformats.org/drawingml/2006/picture">
-            <wp:extent cx="4206240" cy="1635760"/>
+            <wp:extent cx="4206240" cy="1645920"/>
             <wp:docPr id="9" name="Picture 9"/>
             <wp:cNvGraphicFramePr>
               <a:graphicFrameLocks noChangeAspect="1"/>
@@ -974,7 +974,7 @@
                   <pic:spPr>
                     <a:xfrm>
                       <a:off x="0" y="0"/>
-                      <a:ext cx="4206240" cy="1635760"/>
+                      <a:ext cx="4206240" cy="1645920"/>
                     </a:xfrm>
                     <a:prstGeom prst="rect"/>
                   </pic:spPr>
@@ -1023,7 +1023,7 @@
           <w:rFonts w:ascii="Times New Roman" w:hAnsi="Times New Roman"/>
           <w:sz w:val="24"/>
         </w:rPr>
-        <w:t>1. Yêu cầu bài tập: Xây dựng Dashboard đa Form hoàn chỉnh trên frmMain gồm: MenuStrip đầy đủ các phân hệ, ToolStrip truy cập nhanh, StatusStrip hiển thị trạng thái hệ thống, tên người dùng đăng nhập và đồng hồ thời gian thực (Timer cập nhật liên tục từng giây); bổ sung hộp thoại Giới thiệu ứng dụng (AboutBox).</w:t>
+        <w:t>1. Yêu cầu bài tập: Xây dựng Dashboard đa Form hoàn chỉnh trên frmMain gồm: MenuStrip đầy đủ các phân hệ, ToolStrip truy cập nhanh, StatusStrip hiển thị trạng thái hệ thống, tên người dùng đăng nhập và đồng hồ thời gian thực (Timer cập nhật liên tục từng giây); bổ sung hộp thoại Giới thiệu ứng dụng (AboutBox) rộng rãi, chữ hiển thị đầy đủ 100% không bị che khuất.</w:t>
         <w:br/>
         <w:t>2. Dữ liệu thử nghiệm: Dashboard hoạt động mượt mà, đồng hồ thời gian thực nhảy giây chính xác, thanh trạng thái hiển thị 'Người dùng: Phan Văn Thắng (24002545)'; mở hộp thoại Giới thiệu hiển thị rõ ràng thông tin tác giả và học phần.</w:t>
       </w:r>
@@ -1036,7 +1036,7 @@
       <w:r>
         <w:drawing>
           <wp:inline xmlns:a="http://schemas.openxmlformats.org/drawingml/2006/main" xmlns:pic="http://schemas.openxmlformats.org/drawingml/2006/picture">
-            <wp:extent cx="4937760" cy="3203802"/>
+            <wp:extent cx="5029200" cy="3309214"/>
             <wp:docPr id="10" name="Picture 10"/>
             <wp:cNvGraphicFramePr>
               <a:graphicFrameLocks noChangeAspect="1"/>
@@ -1057,7 +1057,7 @@
                   <pic:spPr>
                     <a:xfrm>
                       <a:off x="0" y="0"/>
-                      <a:ext cx="4937760" cy="3203802"/>
+                      <a:ext cx="5029200" cy="3309214"/>
                     </a:xfrm>
                     <a:prstGeom prst="rect"/>
                   </pic:spPr>
@@ -1091,7 +1091,7 @@
       <w:r>
         <w:drawing>
           <wp:inline xmlns:a="http://schemas.openxmlformats.org/drawingml/2006/main" xmlns:pic="http://schemas.openxmlformats.org/drawingml/2006/picture">
-            <wp:extent cx="4389120" cy="2967045"/>
+            <wp:extent cx="4572000" cy="2713703"/>
             <wp:docPr id="11" name="Picture 11"/>
             <wp:cNvGraphicFramePr>
               <a:graphicFrameLocks noChangeAspect="1"/>
@@ -1112,7 +1112,7 @@
                   <pic:spPr>
                     <a:xfrm>
                       <a:off x="0" y="0"/>
-                      <a:ext cx="4389120" cy="2967045"/>
+                      <a:ext cx="4572000" cy="2713703"/>
                     </a:xfrm>
                     <a:prstGeom prst="rect"/>
                   </pic:spPr>
@@ -1135,7 +1135,7 @@
           <w:color w:val="505050"/>
           <w:sz w:val="21"/>
         </w:rPr>
-        <w:t>Hình 10.2: Hộp thoại Giới thiệu ứng dụng và thông tin sinh viên (Bài 10)</w:t>
+        <w:t>Hình 10.2: Hộp thoại Giới thiệu ứng dụng hiển thị đầy đủ thông tin (Bài 10)</w:t>
       </w:r>
     </w:p>
     <w:sectPr>

</xml_diff>

<commit_message>
Mo rong toan dien layout cac Form tranh de chu va cap nhat anh chup bao cao
</commit_message>
<xml_diff>
--- a/24002545_PhanVanThang_Lab5.docx
+++ b/24002545_PhanVanThang_Lab5.docx
@@ -289,7 +289,7 @@
       <w:r>
         <w:drawing>
           <wp:inline xmlns:a="http://schemas.openxmlformats.org/drawingml/2006/main" xmlns:pic="http://schemas.openxmlformats.org/drawingml/2006/picture">
-            <wp:extent cx="4937760" cy="3415284"/>
+            <wp:extent cx="4937760" cy="3365473"/>
             <wp:docPr id="1" name="Picture 1"/>
             <wp:cNvGraphicFramePr>
               <a:graphicFrameLocks noChangeAspect="1"/>
@@ -310,7 +310,7 @@
                   <pic:spPr>
                     <a:xfrm>
                       <a:off x="0" y="0"/>
-                      <a:ext cx="4937760" cy="3415284"/>
+                      <a:ext cx="4937760" cy="3365473"/>
                     </a:xfrm>
                     <a:prstGeom prst="rect"/>
                   </pic:spPr>
@@ -372,7 +372,7 @@
       <w:r>
         <w:drawing>
           <wp:inline xmlns:a="http://schemas.openxmlformats.org/drawingml/2006/main" xmlns:pic="http://schemas.openxmlformats.org/drawingml/2006/picture">
-            <wp:extent cx="4937760" cy="3415284"/>
+            <wp:extent cx="4937760" cy="3365473"/>
             <wp:docPr id="2" name="Picture 2"/>
             <wp:cNvGraphicFramePr>
               <a:graphicFrameLocks noChangeAspect="1"/>
@@ -393,7 +393,7 @@
                   <pic:spPr>
                     <a:xfrm>
                       <a:off x="0" y="0"/>
-                      <a:ext cx="4937760" cy="3415284"/>
+                      <a:ext cx="4937760" cy="3365473"/>
                     </a:xfrm>
                     <a:prstGeom prst="rect"/>
                   </pic:spPr>
@@ -455,7 +455,7 @@
       <w:r>
         <w:drawing>
           <wp:inline xmlns:a="http://schemas.openxmlformats.org/drawingml/2006/main" xmlns:pic="http://schemas.openxmlformats.org/drawingml/2006/picture">
-            <wp:extent cx="4937760" cy="3415284"/>
+            <wp:extent cx="4937760" cy="3365473"/>
             <wp:docPr id="3" name="Picture 3"/>
             <wp:cNvGraphicFramePr>
               <a:graphicFrameLocks noChangeAspect="1"/>
@@ -476,7 +476,7 @@
                   <pic:spPr>
                     <a:xfrm>
                       <a:off x="0" y="0"/>
-                      <a:ext cx="4937760" cy="3415284"/>
+                      <a:ext cx="4937760" cy="3365473"/>
                     </a:xfrm>
                     <a:prstGeom prst="rect"/>
                   </pic:spPr>
@@ -538,7 +538,7 @@
       <w:r>
         <w:drawing>
           <wp:inline xmlns:a="http://schemas.openxmlformats.org/drawingml/2006/main" xmlns:pic="http://schemas.openxmlformats.org/drawingml/2006/picture">
-            <wp:extent cx="4572000" cy="3008671"/>
+            <wp:extent cx="4572000" cy="2986088"/>
             <wp:docPr id="4" name="Picture 4"/>
             <wp:cNvGraphicFramePr>
               <a:graphicFrameLocks noChangeAspect="1"/>
@@ -559,7 +559,7 @@
                   <pic:spPr>
                     <a:xfrm>
                       <a:off x="0" y="0"/>
-                      <a:ext cx="4572000" cy="3008671"/>
+                      <a:ext cx="4572000" cy="2986088"/>
                     </a:xfrm>
                     <a:prstGeom prst="rect"/>
                   </pic:spPr>
@@ -621,7 +621,7 @@
       <w:r>
         <w:drawing>
           <wp:inline xmlns:a="http://schemas.openxmlformats.org/drawingml/2006/main" xmlns:pic="http://schemas.openxmlformats.org/drawingml/2006/picture">
-            <wp:extent cx="5029200" cy="3309214"/>
+            <wp:extent cx="5029200" cy="3250353"/>
             <wp:docPr id="5" name="Picture 5"/>
             <wp:cNvGraphicFramePr>
               <a:graphicFrameLocks noChangeAspect="1"/>
@@ -642,7 +642,7 @@
                   <pic:spPr>
                     <a:xfrm>
                       <a:off x="0" y="0"/>
-                      <a:ext cx="5029200" cy="3309214"/>
+                      <a:ext cx="5029200" cy="3250353"/>
                     </a:xfrm>
                     <a:prstGeom prst="rect"/>
                   </pic:spPr>
@@ -704,7 +704,7 @@
       <w:r>
         <w:drawing>
           <wp:inline xmlns:a="http://schemas.openxmlformats.org/drawingml/2006/main" xmlns:pic="http://schemas.openxmlformats.org/drawingml/2006/picture">
-            <wp:extent cx="4206240" cy="2753175"/>
+            <wp:extent cx="4206240" cy="2724912"/>
             <wp:docPr id="6" name="Picture 6"/>
             <wp:cNvGraphicFramePr>
               <a:graphicFrameLocks noChangeAspect="1"/>
@@ -725,7 +725,7 @@
                   <pic:spPr>
                     <a:xfrm>
                       <a:off x="0" y="0"/>
-                      <a:ext cx="4206240" cy="2753175"/>
+                      <a:ext cx="4206240" cy="2724912"/>
                     </a:xfrm>
                     <a:prstGeom prst="rect"/>
                   </pic:spPr>
@@ -787,7 +787,7 @@
       <w:r>
         <w:drawing>
           <wp:inline xmlns:a="http://schemas.openxmlformats.org/drawingml/2006/main" xmlns:pic="http://schemas.openxmlformats.org/drawingml/2006/picture">
-            <wp:extent cx="4206240" cy="2370790"/>
+            <wp:extent cx="4206240" cy="2633472"/>
             <wp:docPr id="7" name="Picture 7"/>
             <wp:cNvGraphicFramePr>
               <a:graphicFrameLocks noChangeAspect="1"/>
@@ -808,7 +808,7 @@
                   <pic:spPr>
                     <a:xfrm>
                       <a:off x="0" y="0"/>
-                      <a:ext cx="4206240" cy="2370790"/>
+                      <a:ext cx="4206240" cy="2633472"/>
                     </a:xfrm>
                     <a:prstGeom prst="rect"/>
                   </pic:spPr>
@@ -870,7 +870,7 @@
       <w:r>
         <w:drawing>
           <wp:inline xmlns:a="http://schemas.openxmlformats.org/drawingml/2006/main" xmlns:pic="http://schemas.openxmlformats.org/drawingml/2006/picture">
-            <wp:extent cx="4023360" cy="3198571"/>
+            <wp:extent cx="4023360" cy="3162548"/>
             <wp:docPr id="8" name="Picture 8"/>
             <wp:cNvGraphicFramePr>
               <a:graphicFrameLocks noChangeAspect="1"/>
@@ -891,7 +891,7 @@
                   <pic:spPr>
                     <a:xfrm>
                       <a:off x="0" y="0"/>
-                      <a:ext cx="4023360" cy="3198571"/>
+                      <a:ext cx="4023360" cy="3162548"/>
                     </a:xfrm>
                     <a:prstGeom prst="rect"/>
                   </pic:spPr>
@@ -953,7 +953,7 @@
       <w:r>
         <w:drawing>
           <wp:inline xmlns:a="http://schemas.openxmlformats.org/drawingml/2006/main" xmlns:pic="http://schemas.openxmlformats.org/drawingml/2006/picture">
-            <wp:extent cx="4206240" cy="1645920"/>
+            <wp:extent cx="4206240" cy="1621155"/>
             <wp:docPr id="9" name="Picture 9"/>
             <wp:cNvGraphicFramePr>
               <a:graphicFrameLocks noChangeAspect="1"/>
@@ -974,7 +974,7 @@
                   <pic:spPr>
                     <a:xfrm>
                       <a:off x="0" y="0"/>
-                      <a:ext cx="4206240" cy="1645920"/>
+                      <a:ext cx="4206240" cy="1621155"/>
                     </a:xfrm>
                     <a:prstGeom prst="rect"/>
                   </pic:spPr>
@@ -1036,7 +1036,7 @@
       <w:r>
         <w:drawing>
           <wp:inline xmlns:a="http://schemas.openxmlformats.org/drawingml/2006/main" xmlns:pic="http://schemas.openxmlformats.org/drawingml/2006/picture">
-            <wp:extent cx="5029200" cy="3309214"/>
+            <wp:extent cx="5029200" cy="3250353"/>
             <wp:docPr id="10" name="Picture 10"/>
             <wp:cNvGraphicFramePr>
               <a:graphicFrameLocks noChangeAspect="1"/>
@@ -1057,7 +1057,7 @@
                   <pic:spPr>
                     <a:xfrm>
                       <a:off x="0" y="0"/>
-                      <a:ext cx="5029200" cy="3309214"/>
+                      <a:ext cx="5029200" cy="3250353"/>
                     </a:xfrm>
                     <a:prstGeom prst="rect"/>
                   </pic:spPr>
@@ -1091,7 +1091,7 @@
       <w:r>
         <w:drawing>
           <wp:inline xmlns:a="http://schemas.openxmlformats.org/drawingml/2006/main" xmlns:pic="http://schemas.openxmlformats.org/drawingml/2006/picture">
-            <wp:extent cx="4572000" cy="2713703"/>
+            <wp:extent cx="4572000" cy="2700338"/>
             <wp:docPr id="11" name="Picture 11"/>
             <wp:cNvGraphicFramePr>
               <a:graphicFrameLocks noChangeAspect="1"/>
@@ -1112,7 +1112,7 @@
                   <pic:spPr>
                     <a:xfrm>
                       <a:off x="0" y="0"/>
-                      <a:ext cx="4572000" cy="2713703"/>
+                      <a:ext cx="4572000" cy="2700338"/>
                     </a:xfrm>
                     <a:prstGeom prst="rect"/>
                   </pic:spPr>

</xml_diff>